<commit_message>
ASO submission parts rebuilt on a runner (CI)
rebuild after the v2 readability pass — the three .docx parts are derived from the manuscript and went stale when the prose changed

LibreOffice does not work in the dev sandbox: soffice is installed and every
invocation fails with 'source file could not be loaded', including on a trivial
control file. These three .docx artifacts are derived from the manuscript, so any
prose edit re-stales them and reds the trunk. Rebuilt here, where the converter
passed a positive control before the build ran.
</commit_message>
<xml_diff>
--- a/research/manuscripts/aso/fusion-junction-aso-journal-article-figure-legends.docx
+++ b/research/manuscripts/aso/fusion-junction-aso-journal-article-figure-legends.docx
@@ -132,7 +132,7 @@
   <w:docDefaults>
     <w:rPrDefault>
       <w:rPr>
-        <w:rFonts w:ascii="Liberation Serif" w:hAnsi="Liberation Serif" w:eastAsia="WenQuanYi Zen Hei" w:cs="FreeSans"/>
+        <w:rFonts w:ascii="Liberation Serif" w:hAnsi="Liberation Serif" w:eastAsia="DejaVu Sans" w:cs="DejaVu Sans"/>
         <w:sz w:val="24"/>
         <w:szCs w:val="24"/>
         <w:lang w:val="en-US" w:eastAsia="zh-CN" w:bidi="hi-IN"/>
@@ -170,7 +170,7 @@
       <w:outlineLvl w:val="0"/>
     </w:pPr>
     <w:rPr>
-      <w:rFonts w:ascii="Liberation Serif" w:hAnsi="Liberation Serif" w:eastAsia="WenQuanYi Zen Hei" w:cs="FreeSans"/>
+      <w:rFonts w:ascii="Liberation Serif" w:hAnsi="Liberation Serif" w:eastAsia="DejaVu Sans" w:cs="DejaVu Sans"/>
       <w:b/>
       <w:bCs/>
       <w:sz w:val="28"/>
@@ -191,7 +191,7 @@
       <w:outlineLvl w:val="1"/>
     </w:pPr>
     <w:rPr>
-      <w:rFonts w:ascii="Liberation Serif" w:hAnsi="Liberation Serif" w:eastAsia="WenQuanYi Zen Hei" w:cs="FreeSans"/>
+      <w:rFonts w:ascii="Liberation Serif" w:hAnsi="Liberation Serif" w:eastAsia="DejaVu Sans" w:cs="DejaVu Sans"/>
       <w:b/>
       <w:bCs/>
       <w:sz w:val="26"/>
@@ -209,7 +209,7 @@
       <w:outlineLvl w:val="2"/>
     </w:pPr>
     <w:rPr>
-      <w:rFonts w:ascii="Liberation Serif" w:hAnsi="Liberation Serif" w:eastAsia="WenQuanYi Zen Hei" w:cs="FreeSans"/>
+      <w:rFonts w:ascii="Liberation Serif" w:hAnsi="Liberation Serif" w:eastAsia="DejaVu Sans" w:cs="DejaVu Sans"/>
       <w:b/>
       <w:bCs/>
       <w:sz w:val="22"/>
@@ -276,7 +276,7 @@
       <w:spacing w:before="240" w:after="120"/>
     </w:pPr>
     <w:rPr>
-      <w:rFonts w:ascii="Liberation Sans" w:hAnsi="Liberation Sans" w:eastAsia="WenQuanYi Zen Hei" w:cs="FreeSans"/>
+      <w:rFonts w:ascii="Liberation Sans" w:hAnsi="Liberation Sans" w:eastAsia="DejaVu Sans" w:cs="DejaVu Sans"/>
       <w:sz w:val="28"/>
       <w:szCs w:val="28"/>
     </w:rPr>
@@ -295,9 +295,7 @@
     <w:name w:val="List"/>
     <w:basedOn w:val="BodyText"/>
     <w:pPr/>
-    <w:rPr>
-      <w:rFonts w:cs="FreeSans"/>
-    </w:rPr>
+    <w:rPr/>
   </w:style>
   <w:style w:type="paragraph" w:styleId="Caption">
     <w:name w:val="Caption"/>
@@ -308,7 +306,6 @@
       <w:spacing w:before="120" w:after="120"/>
     </w:pPr>
     <w:rPr>
-      <w:rFonts w:cs="FreeSans"/>
       <w:i/>
       <w:iCs/>
       <w:sz w:val="24"/>
@@ -322,9 +319,7 @@
     <w:pPr>
       <w:suppressLineNumbers/>
     </w:pPr>
-    <w:rPr>
-      <w:rFonts w:cs="FreeSans"/>
-    </w:rPr>
+    <w:rPr/>
   </w:style>
   <w:style w:type="paragraph" w:styleId="BlockQuotation">
     <w:name w:val="Block Quotation"/>

</xml_diff>